<commit_message>
Add event management endpoints
</commit_message>
<xml_diff>
--- a/Documents/RaceDay_API_Endpoint_Plan.docx
+++ b/Documents/RaceDay_API_Endpoint_Plan.docx
@@ -167,33 +167,17 @@
           </w:tcPr>
           <w:p>
             <w:r>
-              <w:t>/</w:t>
-            </w:r>
-            <w:proofErr w:type="spellStart"/>
-            <w:r>
-              <w:t>api</w:t>
-            </w:r>
-            <w:proofErr w:type="spellEnd"/>
-            <w:r>
-              <w:t>/auth/register</w:t>
-            </w:r>
-          </w:p>
-        </w:tc>
-        <w:tc>
-          <w:tcPr>
-            <w:tcW w:w="2534" w:type="dxa"/>
-          </w:tcPr>
-          <w:p>
-            <w:r>
-              <w:t xml:space="preserve">Register a new user as a Participant or </w:t>
-            </w:r>
-            <w:proofErr w:type="spellStart"/>
-            <w:r>
-              <w:t>Organiser</w:t>
-            </w:r>
-            <w:proofErr w:type="spellEnd"/>
-            <w:r>
-              <w:t>.</w:t>
+              <w:t>/api/auth/register</w:t>
+            </w:r>
+          </w:p>
+        </w:tc>
+        <w:tc>
+          <w:tcPr>
+            <w:tcW w:w="2534" w:type="dxa"/>
+          </w:tcPr>
+          <w:p>
+            <w:r>
+              <w:t>Register a new user as a Participant or Organiser.</w:t>
             </w:r>
           </w:p>
         </w:tc>
@@ -213,15 +197,7 @@
           </w:tcPr>
           <w:p>
             <w:r>
-              <w:t xml:space="preserve">Email, Password, </w:t>
-            </w:r>
-            <w:proofErr w:type="spellStart"/>
-            <w:r>
-              <w:t>UserType</w:t>
-            </w:r>
-            <w:proofErr w:type="spellEnd"/>
-            <w:r>
-              <w:t xml:space="preserve"> and relevant profile details</w:t>
+              <w:t>Email, Password, UserType and relevant profile details</w:t>
             </w:r>
           </w:p>
         </w:tc>
@@ -334,21 +310,7 @@
                     <w:rPr>
                       <w:lang w:val="en-GB"/>
                     </w:rPr>
-                    <w:t>/</w:t>
-                  </w:r>
-                  <w:proofErr w:type="spellStart"/>
-                  <w:r>
-                    <w:rPr>
-                      <w:lang w:val="en-GB"/>
-                    </w:rPr>
-                    <w:t>api</w:t>
-                  </w:r>
-                  <w:proofErr w:type="spellEnd"/>
-                  <w:r>
-                    <w:rPr>
-                      <w:lang w:val="en-GB"/>
-                    </w:rPr>
-                    <w:t>/auth/login</w:t>
+                    <w:t>/api/auth/login</w:t>
                   </w:r>
                 </w:p>
               </w:tc>
@@ -419,12 +381,10 @@
             <w:r>
               <w:t>/</w:t>
             </w:r>
-            <w:proofErr w:type="spellStart"/>
             <w:proofErr w:type="gramStart"/>
             <w:r>
               <w:t>api</w:t>
             </w:r>
-            <w:proofErr w:type="spellEnd"/>
             <w:proofErr w:type="gramEnd"/>
             <w:r>
               <w:t>/</w:t>
@@ -502,12 +462,10 @@
             <w:r>
               <w:t>/</w:t>
             </w:r>
-            <w:proofErr w:type="spellStart"/>
             <w:proofErr w:type="gramStart"/>
             <w:r>
               <w:t>api</w:t>
             </w:r>
-            <w:proofErr w:type="spellEnd"/>
             <w:proofErr w:type="gramEnd"/>
             <w:r>
               <w:t>/</w:t>
@@ -526,25 +484,41 @@
           <w:tcPr>
             <w:tcW w:w="2534" w:type="dxa"/>
           </w:tcPr>
-          <w:p/>
-        </w:tc>
-        <w:tc>
-          <w:tcPr>
-            <w:tcW w:w="2534" w:type="dxa"/>
-          </w:tcPr>
-          <w:p/>
-        </w:tc>
-        <w:tc>
-          <w:tcPr>
-            <w:tcW w:w="2534" w:type="dxa"/>
-          </w:tcPr>
-          <w:p/>
-        </w:tc>
-        <w:tc>
-          <w:tcPr>
-            <w:tcW w:w="2534" w:type="dxa"/>
-          </w:tcPr>
-          <w:p/>
+          <w:p>
+            <w:r>
+              <w:t>Update the user's account information.</w:t>
+            </w:r>
+          </w:p>
+        </w:tc>
+        <w:tc>
+          <w:tcPr>
+            <w:tcW w:w="2534" w:type="dxa"/>
+          </w:tcPr>
+          <w:p>
+            <w:r>
+              <w:t>Authenticated User</w:t>
+            </w:r>
+          </w:p>
+        </w:tc>
+        <w:tc>
+          <w:tcPr>
+            <w:tcW w:w="2534" w:type="dxa"/>
+          </w:tcPr>
+          <w:p>
+            <w:r>
+              <w:t>Updated user details</w:t>
+            </w:r>
+          </w:p>
+        </w:tc>
+        <w:tc>
+          <w:tcPr>
+            <w:tcW w:w="2534" w:type="dxa"/>
+          </w:tcPr>
+          <w:p>
+            <w:r>
+              <w:t>200 OK with updated profile</w:t>
+            </w:r>
+          </w:p>
         </w:tc>
       </w:tr>
       <w:tr>
@@ -569,12 +543,10 @@
             <w:r>
               <w:t>/</w:t>
             </w:r>
-            <w:proofErr w:type="spellStart"/>
             <w:proofErr w:type="gramStart"/>
             <w:r>
               <w:t>api</w:t>
             </w:r>
-            <w:proofErr w:type="spellEnd"/>
             <w:proofErr w:type="gramEnd"/>
             <w:r>
               <w:t>/</w:t>
@@ -636,12 +608,10 @@
             <w:r>
               <w:t>/</w:t>
             </w:r>
-            <w:proofErr w:type="spellStart"/>
             <w:proofErr w:type="gramStart"/>
             <w:r>
               <w:t>api</w:t>
             </w:r>
-            <w:proofErr w:type="spellEnd"/>
             <w:proofErr w:type="gramEnd"/>
             <w:r>
               <w:t>/</w:t>
@@ -703,24 +673,17 @@
             <w:r>
               <w:t>/</w:t>
             </w:r>
-            <w:proofErr w:type="spellStart"/>
             <w:proofErr w:type="gramStart"/>
             <w:r>
               <w:t>api</w:t>
             </w:r>
-            <w:proofErr w:type="spellEnd"/>
-            <w:proofErr w:type="gramEnd"/>
-            <w:r>
-              <w:t>/</w:t>
-            </w:r>
-            <w:proofErr w:type="spellStart"/>
-            <w:proofErr w:type="gramStart"/>
-            <w:r>
-              <w:t>organisers</w:t>
-            </w:r>
-            <w:proofErr w:type="spellEnd"/>
-            <w:r>
-              <w:t>/{</w:t>
+            <w:proofErr w:type="gramEnd"/>
+            <w:r>
+              <w:t>/</w:t>
+            </w:r>
+            <w:proofErr w:type="gramStart"/>
+            <w:r>
+              <w:t>organisers/{</w:t>
             </w:r>
             <w:proofErr w:type="gramEnd"/>
             <w:r>
@@ -775,24 +738,17 @@
             <w:r>
               <w:t>/</w:t>
             </w:r>
-            <w:proofErr w:type="spellStart"/>
             <w:proofErr w:type="gramStart"/>
             <w:r>
               <w:t>api</w:t>
             </w:r>
-            <w:proofErr w:type="spellEnd"/>
-            <w:proofErr w:type="gramEnd"/>
-            <w:r>
-              <w:t>/</w:t>
-            </w:r>
-            <w:proofErr w:type="spellStart"/>
-            <w:proofErr w:type="gramStart"/>
-            <w:r>
-              <w:t>organisers</w:t>
-            </w:r>
-            <w:proofErr w:type="spellEnd"/>
-            <w:r>
-              <w:t>/{</w:t>
+            <w:proofErr w:type="gramEnd"/>
+            <w:r>
+              <w:t>/</w:t>
+            </w:r>
+            <w:proofErr w:type="gramStart"/>
+            <w:r>
+              <w:t>organisers/{</w:t>
             </w:r>
             <w:proofErr w:type="gramEnd"/>
             <w:r>
@@ -845,15 +801,7 @@
           </w:tcPr>
           <w:p>
             <w:r>
-              <w:t>/</w:t>
-            </w:r>
-            <w:proofErr w:type="spellStart"/>
-            <w:r>
-              <w:t>api</w:t>
-            </w:r>
-            <w:proofErr w:type="spellEnd"/>
-            <w:r>
-              <w:t>/events</w:t>
+              <w:t>/api/events</w:t>
             </w:r>
           </w:p>
         </w:tc>
@@ -904,12 +852,10 @@
             <w:r>
               <w:t>/</w:t>
             </w:r>
-            <w:proofErr w:type="spellStart"/>
             <w:proofErr w:type="gramStart"/>
             <w:r>
               <w:t>api</w:t>
             </w:r>
-            <w:proofErr w:type="spellEnd"/>
             <w:proofErr w:type="gramEnd"/>
             <w:r>
               <w:t>/</w:t>
@@ -969,15 +915,7 @@
           </w:tcPr>
           <w:p>
             <w:r>
-              <w:t>/</w:t>
-            </w:r>
-            <w:proofErr w:type="spellStart"/>
-            <w:r>
-              <w:t>api</w:t>
-            </w:r>
-            <w:proofErr w:type="spellEnd"/>
-            <w:r>
-              <w:t>/events</w:t>
+              <w:t>/api/events</w:t>
             </w:r>
           </w:p>
         </w:tc>
@@ -1028,12 +966,10 @@
             <w:r>
               <w:t>/</w:t>
             </w:r>
-            <w:proofErr w:type="spellStart"/>
             <w:proofErr w:type="gramStart"/>
             <w:r>
               <w:t>api</w:t>
             </w:r>
-            <w:proofErr w:type="spellEnd"/>
             <w:proofErr w:type="gramEnd"/>
             <w:r>
               <w:t>/</w:t>
@@ -1095,12 +1031,10 @@
             <w:r>
               <w:t>/</w:t>
             </w:r>
-            <w:proofErr w:type="spellStart"/>
             <w:proofErr w:type="gramStart"/>
             <w:r>
               <w:t>api</w:t>
             </w:r>
-            <w:proofErr w:type="spellEnd"/>
             <w:proofErr w:type="gramEnd"/>
             <w:r>
               <w:t>/</w:t>
@@ -1160,15 +1094,7 @@
           </w:tcPr>
           <w:p>
             <w:r>
-              <w:t>/</w:t>
-            </w:r>
-            <w:proofErr w:type="spellStart"/>
-            <w:r>
-              <w:t>api</w:t>
-            </w:r>
-            <w:proofErr w:type="spellEnd"/>
-            <w:r>
-              <w:t>/categories</w:t>
+              <w:t>/api/categories</w:t>
             </w:r>
           </w:p>
         </w:tc>
@@ -1219,12 +1145,10 @@
             <w:r>
               <w:t>/</w:t>
             </w:r>
-            <w:proofErr w:type="spellStart"/>
             <w:proofErr w:type="gramStart"/>
             <w:r>
               <w:t>api</w:t>
             </w:r>
-            <w:proofErr w:type="spellEnd"/>
             <w:proofErr w:type="gramEnd"/>
             <w:r>
               <w:t>/</w:t>
@@ -1274,6 +1198,7 @@
           </w:tcPr>
           <w:p>
             <w:r>
+              <w:lastRenderedPageBreak/>
               <w:t>POST</w:t>
             </w:r>
           </w:p>
@@ -1284,15 +1209,7 @@
           </w:tcPr>
           <w:p>
             <w:r>
-              <w:t>/</w:t>
-            </w:r>
-            <w:proofErr w:type="spellStart"/>
-            <w:r>
-              <w:t>api</w:t>
-            </w:r>
-            <w:proofErr w:type="spellEnd"/>
-            <w:r>
-              <w:t>/categories</w:t>
+              <w:t>/api/categories</w:t>
             </w:r>
           </w:p>
         </w:tc>
@@ -1343,12 +1260,10 @@
             <w:r>
               <w:t>/</w:t>
             </w:r>
-            <w:proofErr w:type="spellStart"/>
             <w:proofErr w:type="gramStart"/>
             <w:r>
               <w:t>api</w:t>
             </w:r>
-            <w:proofErr w:type="spellEnd"/>
             <w:proofErr w:type="gramEnd"/>
             <w:r>
               <w:t>/</w:t>
@@ -1398,7 +1313,6 @@
           </w:tcPr>
           <w:p>
             <w:r>
-              <w:lastRenderedPageBreak/>
               <w:t>DELETE</w:t>
             </w:r>
           </w:p>
@@ -1411,12 +1325,10 @@
             <w:r>
               <w:t>/</w:t>
             </w:r>
-            <w:proofErr w:type="spellStart"/>
             <w:proofErr w:type="gramStart"/>
             <w:r>
               <w:t>api</w:t>
             </w:r>
-            <w:proofErr w:type="spellEnd"/>
             <w:proofErr w:type="gramEnd"/>
             <w:r>
               <w:t>/</w:t>
@@ -1478,27 +1390,17 @@
             <w:r>
               <w:t>/</w:t>
             </w:r>
-            <w:proofErr w:type="spellStart"/>
             <w:proofErr w:type="gramStart"/>
             <w:r>
               <w:t>api</w:t>
             </w:r>
-            <w:proofErr w:type="spellEnd"/>
-            <w:proofErr w:type="gramEnd"/>
-            <w:r>
-              <w:t>/</w:t>
-            </w:r>
-            <w:proofErr w:type="gramStart"/>
-            <w:r>
-              <w:t>events/{</w:t>
-            </w:r>
-            <w:proofErr w:type="spellStart"/>
-            <w:r>
-              <w:t>eventId</w:t>
-            </w:r>
-            <w:proofErr w:type="spellEnd"/>
-            <w:r>
-              <w:t>}/</w:t>
+            <w:proofErr w:type="gramEnd"/>
+            <w:r>
+              <w:t>/</w:t>
+            </w:r>
+            <w:proofErr w:type="gramStart"/>
+            <w:r>
+              <w:t>events/{eventId}/</w:t>
             </w:r>
             <w:proofErr w:type="gramEnd"/>
             <w:r>
@@ -1553,27 +1455,17 @@
             <w:r>
               <w:t>/</w:t>
             </w:r>
-            <w:proofErr w:type="spellStart"/>
             <w:proofErr w:type="gramStart"/>
             <w:r>
               <w:t>api</w:t>
             </w:r>
-            <w:proofErr w:type="spellEnd"/>
-            <w:proofErr w:type="gramEnd"/>
-            <w:r>
-              <w:t>/</w:t>
-            </w:r>
-            <w:proofErr w:type="gramStart"/>
-            <w:r>
-              <w:t>events/{</w:t>
-            </w:r>
-            <w:proofErr w:type="spellStart"/>
-            <w:r>
-              <w:t>eventId</w:t>
-            </w:r>
-            <w:proofErr w:type="spellEnd"/>
-            <w:r>
-              <w:t>}/</w:t>
+            <w:proofErr w:type="gramEnd"/>
+            <w:r>
+              <w:t>/</w:t>
+            </w:r>
+            <w:proofErr w:type="gramStart"/>
+            <w:r>
+              <w:t>events/{eventId}/</w:t>
             </w:r>
             <w:proofErr w:type="gramEnd"/>
             <w:r>
@@ -1628,12 +1520,10 @@
             <w:r>
               <w:t>/</w:t>
             </w:r>
-            <w:proofErr w:type="spellStart"/>
             <w:proofErr w:type="gramStart"/>
             <w:r>
               <w:t>api</w:t>
             </w:r>
-            <w:proofErr w:type="spellEnd"/>
             <w:proofErr w:type="gramEnd"/>
             <w:r>
               <w:t>/</w:t>
@@ -1695,12 +1585,10 @@
             <w:r>
               <w:t>/</w:t>
             </w:r>
-            <w:proofErr w:type="spellStart"/>
             <w:proofErr w:type="gramStart"/>
             <w:r>
               <w:t>api</w:t>
             </w:r>
-            <w:proofErr w:type="spellEnd"/>
             <w:proofErr w:type="gramEnd"/>
             <w:r>
               <w:t>/</w:t>

</xml_diff>